<commit_message>
Actualizar gitignore, docs GLPI y script lanzador
</commit_message>
<xml_diff>
--- a/GLPI/docs/glpi-agent-instalacion.docx
+++ b/GLPI/docs/glpi-agent-instalacion.docx
@@ -172,7 +172,7 @@
                 <w:sz w:val="18"/>
                 <w:szCs w:val="18"/>
               </w:rPr>
-              <w:t xml:space="preserve">1.1</w:t>
+              <w:t xml:space="preserve">2.0</w:t>
             </w:r>
           </w:p>
         </w:tc>
@@ -531,54 +531,218 @@
           <w:sz w:val="28"/>
           <w:szCs w:val="28"/>
         </w:rPr>
-        <w:t xml:space="preserve">2. Método 1 — Instalación silenciosa con script (recomendada)</w:t>
-      </w:r>
-    </w:p>
-    <w:p>
-      <w:pPr>
-        <w:pStyle w:val="ListParagraph"/>
-        <w:numPr>
-          <w:ilvl w:val="0"/>
-          <w:numId w:val="3"/>
-        </w:numPr>
-      </w:pPr>
-      <w:r>
-        <w:rPr>
-          <w:rFonts w:ascii="Arial" w:cs="Arial" w:eastAsia="Arial" w:hAnsi="Arial"/>
-          <w:sz w:val="22"/>
-          <w:szCs w:val="22"/>
-        </w:rPr>
-        <w:t xml:space="preserve">Descargar el script instalar-glpi-agent.bat desde el repositorio interno.</w:t>
-      </w:r>
-    </w:p>
-    <w:p>
-      <w:pPr>
-        <w:pStyle w:val="ListParagraph"/>
-        <w:numPr>
-          <w:ilvl w:val="0"/>
-          <w:numId w:val="3"/>
-        </w:numPr>
-      </w:pPr>
-      <w:r>
-        <w:rPr>
-          <w:rFonts w:ascii="Arial" w:cs="Arial" w:eastAsia="Arial" w:hAnsi="Arial"/>
-          <w:sz w:val="22"/>
-          <w:szCs w:val="22"/>
-        </w:rPr>
-        <w:t xml:space="preserve">Ejecutar con clic derecho → Ejecutar como administrador.</w:t>
-      </w:r>
-    </w:p>
-    <w:p/>
-    <w:p>
-      <w:r>
-        <w:rPr>
-          <w:rFonts w:ascii="Arial" w:cs="Arial" w:eastAsia="Arial" w:hAnsi="Arial"/>
-          <w:sz w:val="22"/>
-          <w:szCs w:val="22"/>
-        </w:rPr>
-        <w:t xml:space="preserve">El script descarga automáticamente el instalador desde GitHub, realiza la instalación silenciosa y elimina el archivo descargado al finalizar.</w:t>
-      </w:r>
-    </w:p>
+        <w:t xml:space="preserve">2. Archivos</w:t>
+      </w:r>
+    </w:p>
+    <w:tbl>
+      <w:tblPr>
+        <w:tblW w:type="dxa" w:w="9026"/>
+        <w:tblBorders>
+          <w:top w:val="single" w:color="auto" w:sz="4"/>
+          <w:left w:val="single" w:color="auto" w:sz="4"/>
+          <w:bottom w:val="single" w:color="auto" w:sz="4"/>
+          <w:right w:val="single" w:color="auto" w:sz="4"/>
+          <w:insideH w:val="single" w:color="auto" w:sz="4"/>
+          <w:insideV w:val="single" w:color="auto" w:sz="4"/>
+        </w:tblBorders>
+      </w:tblPr>
+      <w:tblGrid>
+        <w:gridCol w:w="3500"/>
+        <w:gridCol w:w="5526"/>
+      </w:tblGrid>
+      <w:tr>
+        <w:tc>
+          <w:tcPr>
+            <w:tcW w:type="dxa" w:w="3500"/>
+            <w:tcBorders>
+              <w:top w:val="single" w:color="CCCCCC" w:sz="1"/>
+              <w:left w:val="single" w:color="CCCCCC" w:sz="1"/>
+              <w:bottom w:val="single" w:color="CCCCCC" w:sz="1"/>
+              <w:right w:val="single" w:color="CCCCCC" w:sz="1"/>
+            </w:tcBorders>
+            <w:shd w:fill="2E75B6" w:val="clear"/>
+            <w:tcMar>
+              <w:top w:type="dxa" w:w="80"/>
+              <w:left w:type="dxa" w:w="120"/>
+              <w:bottom w:type="dxa" w:w="80"/>
+              <w:right w:type="dxa" w:w="120"/>
+            </w:tcMar>
+          </w:tcPr>
+          <w:p>
+            <w:r>
+              <w:rPr>
+                <w:rFonts w:ascii="Arial" w:cs="Arial" w:eastAsia="Arial" w:hAnsi="Arial"/>
+                <w:b/>
+                <w:bCs/>
+                <w:color w:val="FFFFFF"/>
+                <w:sz w:val="18"/>
+                <w:szCs w:val="18"/>
+              </w:rPr>
+              <w:t xml:space="preserve">Archivo</w:t>
+            </w:r>
+          </w:p>
+        </w:tc>
+        <w:tc>
+          <w:tcPr>
+            <w:tcW w:type="dxa" w:w="5526"/>
+            <w:tcBorders>
+              <w:top w:val="single" w:color="CCCCCC" w:sz="1"/>
+              <w:left w:val="single" w:color="CCCCCC" w:sz="1"/>
+              <w:bottom w:val="single" w:color="CCCCCC" w:sz="1"/>
+              <w:right w:val="single" w:color="CCCCCC" w:sz="1"/>
+            </w:tcBorders>
+            <w:shd w:fill="2E75B6" w:val="clear"/>
+            <w:tcMar>
+              <w:top w:type="dxa" w:w="80"/>
+              <w:left w:type="dxa" w:w="120"/>
+              <w:bottom w:type="dxa" w:w="80"/>
+              <w:right w:type="dxa" w:w="120"/>
+            </w:tcMar>
+          </w:tcPr>
+          <w:p>
+            <w:r>
+              <w:rPr>
+                <w:rFonts w:ascii="Arial" w:cs="Arial" w:eastAsia="Arial" w:hAnsi="Arial"/>
+                <w:b/>
+                <w:bCs/>
+                <w:color w:val="FFFFFF"/>
+                <w:sz w:val="18"/>
+                <w:szCs w:val="18"/>
+              </w:rPr>
+              <w:t xml:space="preserve">Descripción</w:t>
+            </w:r>
+          </w:p>
+        </w:tc>
+      </w:tr>
+      <w:tr>
+        <w:tc>
+          <w:tcPr>
+            <w:tcW w:type="dxa" w:w="3500"/>
+            <w:tcBorders>
+              <w:top w:val="single" w:color="CCCCCC" w:sz="1"/>
+              <w:left w:val="single" w:color="CCCCCC" w:sz="1"/>
+              <w:bottom w:val="single" w:color="CCCCCC" w:sz="1"/>
+              <w:right w:val="single" w:color="CCCCCC" w:sz="1"/>
+            </w:tcBorders>
+            <w:shd w:fill="FFFFFF" w:val="clear"/>
+            <w:tcMar>
+              <w:top w:type="dxa" w:w="80"/>
+              <w:left w:type="dxa" w:w="120"/>
+              <w:bottom w:type="dxa" w:w="80"/>
+              <w:right w:type="dxa" w:w="120"/>
+            </w:tcMar>
+          </w:tcPr>
+          <w:p>
+            <w:r>
+              <w:rPr>
+                <w:rFonts w:ascii="Arial" w:cs="Arial" w:eastAsia="Arial" w:hAnsi="Arial"/>
+                <w:b w:val="false"/>
+                <w:bCs w:val="false"/>
+                <w:color w:val="000000"/>
+                <w:sz w:val="18"/>
+                <w:szCs w:val="18"/>
+              </w:rPr>
+              <w:t xml:space="preserve">instalar-glpi-agent.cmd</w:t>
+            </w:r>
+          </w:p>
+        </w:tc>
+        <w:tc>
+          <w:tcPr>
+            <w:tcW w:type="dxa" w:w="5526"/>
+            <w:tcBorders>
+              <w:top w:val="single" w:color="CCCCCC" w:sz="1"/>
+              <w:left w:val="single" w:color="CCCCCC" w:sz="1"/>
+              <w:bottom w:val="single" w:color="CCCCCC" w:sz="1"/>
+              <w:right w:val="single" w:color="CCCCCC" w:sz="1"/>
+            </w:tcBorders>
+            <w:shd w:fill="FFFFFF" w:val="clear"/>
+            <w:tcMar>
+              <w:top w:type="dxa" w:w="80"/>
+              <w:left w:type="dxa" w:w="120"/>
+              <w:bottom w:type="dxa" w:w="80"/>
+              <w:right w:type="dxa" w:w="120"/>
+            </w:tcMar>
+          </w:tcPr>
+          <w:p>
+            <w:r>
+              <w:rPr>
+                <w:rFonts w:ascii="Arial" w:cs="Arial" w:eastAsia="Arial" w:hAnsi="Arial"/>
+                <w:b w:val="false"/>
+                <w:bCs w:val="false"/>
+                <w:color w:val="000000"/>
+                <w:sz w:val="18"/>
+                <w:szCs w:val="18"/>
+              </w:rPr>
+              <w:t xml:space="preserve">Lanzador. Eleva privilegios y ejecuta el .ps1</w:t>
+            </w:r>
+          </w:p>
+        </w:tc>
+      </w:tr>
+      <w:tr>
+        <w:tc>
+          <w:tcPr>
+            <w:tcW w:type="dxa" w:w="3500"/>
+            <w:tcBorders>
+              <w:top w:val="single" w:color="CCCCCC" w:sz="1"/>
+              <w:left w:val="single" w:color="CCCCCC" w:sz="1"/>
+              <w:bottom w:val="single" w:color="CCCCCC" w:sz="1"/>
+              <w:right w:val="single" w:color="CCCCCC" w:sz="1"/>
+            </w:tcBorders>
+            <w:shd w:fill="FFFFFF" w:val="clear"/>
+            <w:tcMar>
+              <w:top w:type="dxa" w:w="80"/>
+              <w:left w:type="dxa" w:w="120"/>
+              <w:bottom w:type="dxa" w:w="80"/>
+              <w:right w:type="dxa" w:w="120"/>
+            </w:tcMar>
+          </w:tcPr>
+          <w:p>
+            <w:r>
+              <w:rPr>
+                <w:rFonts w:ascii="Arial" w:cs="Arial" w:eastAsia="Arial" w:hAnsi="Arial"/>
+                <w:b w:val="false"/>
+                <w:bCs w:val="false"/>
+                <w:color w:val="000000"/>
+                <w:sz w:val="18"/>
+                <w:szCs w:val="18"/>
+              </w:rPr>
+              <w:t xml:space="preserve">instalar-glpi-agent.ps1</w:t>
+            </w:r>
+          </w:p>
+        </w:tc>
+        <w:tc>
+          <w:tcPr>
+            <w:tcW w:type="dxa" w:w="5526"/>
+            <w:tcBorders>
+              <w:top w:val="single" w:color="CCCCCC" w:sz="1"/>
+              <w:left w:val="single" w:color="CCCCCC" w:sz="1"/>
+              <w:bottom w:val="single" w:color="CCCCCC" w:sz="1"/>
+              <w:right w:val="single" w:color="CCCCCC" w:sz="1"/>
+            </w:tcBorders>
+            <w:shd w:fill="FFFFFF" w:val="clear"/>
+            <w:tcMar>
+              <w:top w:type="dxa" w:w="80"/>
+              <w:left w:type="dxa" w:w="120"/>
+              <w:bottom w:type="dxa" w:w="80"/>
+              <w:right w:type="dxa" w:w="120"/>
+            </w:tcMar>
+          </w:tcPr>
+          <w:p>
+            <w:r>
+              <w:rPr>
+                <w:rFonts w:ascii="Arial" w:cs="Arial" w:eastAsia="Arial" w:hAnsi="Arial"/>
+                <w:b w:val="false"/>
+                <w:bCs w:val="false"/>
+                <w:color w:val="000000"/>
+                <w:sz w:val="18"/>
+                <w:szCs w:val="18"/>
+              </w:rPr>
+              <w:t xml:space="preserve">Script principal de instalación</w:t>
+            </w:r>
+          </w:p>
+        </w:tc>
+      </w:tr>
+    </w:tbl>
     <w:p/>
     <w:tbl>
       <w:tblPr>
@@ -622,7 +786,7 @@
                 <w:sz w:val="20"/>
                 <w:szCs w:val="20"/>
               </w:rPr>
-              <w:t xml:space="preserve">📝 NOTA:  </w:t>
+              <w:t xml:space="preserve">⚠️ IMPORTANTE:  </w:t>
             </w:r>
             <w:r>
               <w:rPr>
@@ -630,7 +794,7 @@
                 <w:sz w:val="20"/>
                 <w:szCs w:val="20"/>
               </w:rPr>
-              <w:t xml:space="preserve">La versión del agente descargada está fijada en el script (GLPI_AGENT_VERSION). Si necesitás actualizar la versión, editá esa variable antes de ejecutar.</w:t>
+              <w:t xml:space="preserve">Ambos archivos deben estar en el mismo directorio. Ejecutar únicamente el .cmd.</w:t>
             </w:r>
           </w:p>
         </w:tc>
@@ -649,7 +813,7 @@
           <w:sz w:val="28"/>
           <w:szCs w:val="28"/>
         </w:rPr>
-        <w:t xml:space="preserve">3. Método 2 — Instalación silenciosa manual</w:t>
+        <w:t xml:space="preserve">3. Método 1 — Instalación con script (recomendada)</w:t>
       </w:r>
     </w:p>
     <w:p>
@@ -666,7 +830,7 @@
           <w:sz w:val="22"/>
           <w:szCs w:val="22"/>
         </w:rPr>
-        <w:t xml:space="preserve">Descargar el instalador desde: https://github.com/glpi-project/glpi-agent/releases/latest</w:t>
+        <w:t xml:space="preserve">Copiar instalar-glpi-agent.cmd e instalar-glpi-agent.ps1 al equipo destino.</w:t>
       </w:r>
     </w:p>
     <w:p>
@@ -683,6 +847,300 @@
           <w:sz w:val="22"/>
           <w:szCs w:val="22"/>
         </w:rPr>
+        <w:t xml:space="preserve">Ejecutar con clic derecho sobre el .cmd → Ejecutar como administrador.</w:t>
+      </w:r>
+    </w:p>
+    <w:p/>
+    <w:p>
+      <w:r>
+        <w:rPr>
+          <w:rFonts w:ascii="Arial" w:cs="Arial" w:eastAsia="Arial" w:hAnsi="Arial"/>
+          <w:sz w:val="22"/>
+          <w:szCs w:val="22"/>
+        </w:rPr>
+        <w:t xml:space="preserve">El script realiza automáticamente:</w:t>
+      </w:r>
+    </w:p>
+    <w:p>
+      <w:pPr>
+        <w:pStyle w:val="ListParagraph"/>
+        <w:numPr>
+          <w:ilvl w:val="0"/>
+          <w:numId w:val="2"/>
+        </w:numPr>
+      </w:pPr>
+      <w:r>
+        <w:rPr>
+          <w:rFonts w:ascii="Arial" w:cs="Arial" w:eastAsia="Arial" w:hAnsi="Arial"/>
+          <w:sz w:val="22"/>
+          <w:szCs w:val="22"/>
+        </w:rPr>
+        <w:t xml:space="preserve">Detección de versión instalada — si ya existe una versión previa, avisa y solicita confirmación antes de desinstalar.</w:t>
+      </w:r>
+    </w:p>
+    <w:p>
+      <w:pPr>
+        <w:pStyle w:val="ListParagraph"/>
+        <w:numPr>
+          <w:ilvl w:val="0"/>
+          <w:numId w:val="2"/>
+        </w:numPr>
+      </w:pPr>
+      <w:r>
+        <w:rPr>
+          <w:rFonts w:ascii="Arial" w:cs="Arial" w:eastAsia="Arial" w:hAnsi="Arial"/>
+          <w:sz w:val="22"/>
+          <w:szCs w:val="22"/>
+        </w:rPr>
+        <w:t xml:space="preserve">Descarga del instalador desde GitHub.</w:t>
+      </w:r>
+    </w:p>
+    <w:p>
+      <w:pPr>
+        <w:pStyle w:val="ListParagraph"/>
+        <w:numPr>
+          <w:ilvl w:val="0"/>
+          <w:numId w:val="2"/>
+        </w:numPr>
+      </w:pPr>
+      <w:r>
+        <w:rPr>
+          <w:rFonts w:ascii="Arial" w:cs="Arial" w:eastAsia="Arial" w:hAnsi="Arial"/>
+          <w:sz w:val="22"/>
+          <w:szCs w:val="22"/>
+        </w:rPr>
+        <w:t xml:space="preserve">Pregunta interactiva para instalar el ícono de bandeja (AGENTMONITOR).</w:t>
+      </w:r>
+    </w:p>
+    <w:p>
+      <w:pPr>
+        <w:pStyle w:val="ListParagraph"/>
+        <w:numPr>
+          <w:ilvl w:val="0"/>
+          <w:numId w:val="2"/>
+        </w:numPr>
+      </w:pPr>
+      <w:r>
+        <w:rPr>
+          <w:rFonts w:ascii="Arial" w:cs="Arial" w:eastAsia="Arial" w:hAnsi="Arial"/>
+          <w:sz w:val="22"/>
+          <w:szCs w:val="22"/>
+        </w:rPr>
+        <w:t xml:space="preserve">Instalación silenciosa del agente.</w:t>
+      </w:r>
+    </w:p>
+    <w:p>
+      <w:pPr>
+        <w:pStyle w:val="ListParagraph"/>
+        <w:numPr>
+          <w:ilvl w:val="0"/>
+          <w:numId w:val="2"/>
+        </w:numPr>
+      </w:pPr>
+      <w:r>
+        <w:rPr>
+          <w:rFonts w:ascii="Arial" w:cs="Arial" w:eastAsia="Arial" w:hAnsi="Arial"/>
+          <w:sz w:val="22"/>
+          <w:szCs w:val="22"/>
+        </w:rPr>
+        <w:t xml:space="preserve">Envío forzado de inventario al servidor GLPI.</w:t>
+      </w:r>
+    </w:p>
+    <w:p>
+      <w:pPr>
+        <w:pStyle w:val="ListParagraph"/>
+        <w:numPr>
+          <w:ilvl w:val="0"/>
+          <w:numId w:val="2"/>
+        </w:numPr>
+      </w:pPr>
+      <w:r>
+        <w:rPr>
+          <w:rFonts w:ascii="Arial" w:cs="Arial" w:eastAsia="Arial" w:hAnsi="Arial"/>
+          <w:sz w:val="22"/>
+          <w:szCs w:val="22"/>
+        </w:rPr>
+        <w:t xml:space="preserve">Generación de inventario local XML en C:\repositorio\GLPI\logs\.</w:t>
+      </w:r>
+    </w:p>
+    <w:p>
+      <w:pPr>
+        <w:pStyle w:val="ListParagraph"/>
+        <w:numPr>
+          <w:ilvl w:val="0"/>
+          <w:numId w:val="2"/>
+        </w:numPr>
+      </w:pPr>
+      <w:r>
+        <w:rPr>
+          <w:rFonts w:ascii="Arial" w:cs="Arial" w:eastAsia="Arial" w:hAnsi="Arial"/>
+          <w:sz w:val="22"/>
+          <w:szCs w:val="22"/>
+        </w:rPr>
+        <w:t xml:space="preserve">Creación de accesos directos a la interfaz local del agente en C:\repositorio\GLPI\.</w:t>
+      </w:r>
+    </w:p>
+    <w:p/>
+    <w:tbl>
+      <w:tblPr>
+        <w:tblW w:type="dxa" w:w="9026"/>
+        <w:tblBorders>
+          <w:top w:val="single" w:color="auto" w:sz="4"/>
+          <w:left w:val="single" w:color="auto" w:sz="4"/>
+          <w:bottom w:val="single" w:color="auto" w:sz="4"/>
+          <w:right w:val="single" w:color="auto" w:sz="4"/>
+          <w:insideH w:val="single" w:color="auto" w:sz="4"/>
+          <w:insideV w:val="single" w:color="auto" w:sz="4"/>
+        </w:tblBorders>
+      </w:tblPr>
+      <w:tblGrid>
+        <w:gridCol w:w="9026"/>
+      </w:tblGrid>
+      <w:tr>
+        <w:tc>
+          <w:tcPr>
+            <w:tcW w:type="dxa" w:w="9026"/>
+            <w:tcBorders>
+              <w:top w:val="single" w:color="CCCCCC" w:sz="1"/>
+              <w:left w:val="single" w:color="CCCCCC" w:sz="1"/>
+              <w:bottom w:val="single" w:color="CCCCCC" w:sz="1"/>
+              <w:right w:val="single" w:color="CCCCCC" w:sz="1"/>
+            </w:tcBorders>
+            <w:shd w:fill="EEF4FB" w:val="clear"/>
+            <w:tcMar>
+              <w:top w:type="dxa" w:w="80"/>
+              <w:left w:type="dxa" w:w="120"/>
+              <w:bottom w:type="dxa" w:w="80"/>
+              <w:right w:type="dxa" w:w="120"/>
+            </w:tcMar>
+          </w:tcPr>
+          <w:p>
+            <w:r>
+              <w:rPr>
+                <w:rFonts w:ascii="Arial" w:cs="Arial" w:eastAsia="Arial" w:hAnsi="Arial"/>
+                <w:b/>
+                <w:bCs/>
+                <w:sz w:val="20"/>
+                <w:szCs w:val="20"/>
+              </w:rPr>
+              <w:t xml:space="preserve">📝 NOTA:  </w:t>
+            </w:r>
+            <w:r>
+              <w:rPr>
+                <w:rFonts w:ascii="Arial" w:cs="Arial" w:eastAsia="Arial" w:hAnsi="Arial"/>
+                <w:sz w:val="20"/>
+                <w:szCs w:val="20"/>
+              </w:rPr>
+              <w:t xml:space="preserve">La versión del agente está fijada en el script ($GLPI_AGENT_VERSION). Para actualizar, modificar esa variable antes de ejecutar.</w:t>
+            </w:r>
+          </w:p>
+        </w:tc>
+      </w:tr>
+    </w:tbl>
+    <w:p/>
+    <w:tbl>
+      <w:tblPr>
+        <w:tblW w:type="dxa" w:w="9026"/>
+        <w:tblBorders>
+          <w:top w:val="single" w:color="auto" w:sz="4"/>
+          <w:left w:val="single" w:color="auto" w:sz="4"/>
+          <w:bottom w:val="single" w:color="auto" w:sz="4"/>
+          <w:right w:val="single" w:color="auto" w:sz="4"/>
+          <w:insideH w:val="single" w:color="auto" w:sz="4"/>
+          <w:insideV w:val="single" w:color="auto" w:sz="4"/>
+        </w:tblBorders>
+      </w:tblPr>
+      <w:tblGrid>
+        <w:gridCol w:w="9026"/>
+      </w:tblGrid>
+      <w:tr>
+        <w:tc>
+          <w:tcPr>
+            <w:tcW w:type="dxa" w:w="9026"/>
+            <w:tcBorders>
+              <w:top w:val="single" w:color="CCCCCC" w:sz="1"/>
+              <w:left w:val="single" w:color="CCCCCC" w:sz="1"/>
+              <w:bottom w:val="single" w:color="CCCCCC" w:sz="1"/>
+              <w:right w:val="single" w:color="CCCCCC" w:sz="1"/>
+            </w:tcBorders>
+            <w:shd w:fill="EEF4FB" w:val="clear"/>
+            <w:tcMar>
+              <w:top w:type="dxa" w:w="80"/>
+              <w:left w:type="dxa" w:w="120"/>
+              <w:bottom w:type="dxa" w:w="80"/>
+              <w:right w:type="dxa" w:w="120"/>
+            </w:tcMar>
+          </w:tcPr>
+          <w:p>
+            <w:r>
+              <w:rPr>
+                <w:rFonts w:ascii="Arial" w:cs="Arial" w:eastAsia="Arial" w:hAnsi="Arial"/>
+                <w:b/>
+                <w:bCs/>
+                <w:sz w:val="20"/>
+                <w:szCs w:val="20"/>
+              </w:rPr>
+              <w:t xml:space="preserve">📝 NOTA:  </w:t>
+            </w:r>
+            <w:r>
+              <w:rPr>
+                <w:rFonts w:ascii="Arial" w:cs="Arial" w:eastAsia="Arial" w:hAnsi="Arial"/>
+                <w:sz w:val="20"/>
+                <w:szCs w:val="20"/>
+              </w:rPr>
+              <w:t xml:space="preserve">Desde la versión 1.8 en adelante, solo se distribuye instalador de 64 bits.</w:t>
+            </w:r>
+          </w:p>
+        </w:tc>
+      </w:tr>
+    </w:tbl>
+    <w:p/>
+    <w:p>
+      <w:pPr>
+        <w:pStyle w:val="Heading1"/>
+      </w:pPr>
+      <w:r>
+        <w:rPr>
+          <w:rFonts w:ascii="Arial" w:cs="Arial" w:eastAsia="Arial" w:hAnsi="Arial"/>
+          <w:b/>
+          <w:bCs/>
+          <w:sz w:val="28"/>
+          <w:szCs w:val="28"/>
+        </w:rPr>
+        <w:t xml:space="preserve">4. Método 2 — Instalación silenciosa manual</w:t>
+      </w:r>
+    </w:p>
+    <w:p>
+      <w:pPr>
+        <w:pStyle w:val="ListParagraph"/>
+        <w:numPr>
+          <w:ilvl w:val="0"/>
+          <w:numId w:val="3"/>
+        </w:numPr>
+      </w:pPr>
+      <w:r>
+        <w:rPr>
+          <w:rFonts w:ascii="Arial" w:cs="Arial" w:eastAsia="Arial" w:hAnsi="Arial"/>
+          <w:sz w:val="22"/>
+          <w:szCs w:val="22"/>
+        </w:rPr>
+        <w:t xml:space="preserve">Descargar el instalador desde: https://github.com/glpi-project/glpi-agent/releases/latest</w:t>
+      </w:r>
+    </w:p>
+    <w:p>
+      <w:pPr>
+        <w:pStyle w:val="ListParagraph"/>
+        <w:numPr>
+          <w:ilvl w:val="0"/>
+          <w:numId w:val="3"/>
+        </w:numPr>
+      </w:pPr>
+      <w:r>
+        <w:rPr>
+          <w:rFonts w:ascii="Arial" w:cs="Arial" w:eastAsia="Arial" w:hAnsi="Arial"/>
+          <w:sz w:val="22"/>
+          <w:szCs w:val="22"/>
+        </w:rPr>
         <w:t xml:space="preserve">Ejecutar desde una consola con privilegios de administrador:</w:t>
       </w:r>
     </w:p>
@@ -768,32 +1226,7 @@
           <w:sz w:val="18"/>
           <w:szCs w:val="18"/>
         </w:rPr>
-        <w:t xml:space="preserve">  AGENTMONITOR=1 ^</w:t>
-      </w:r>
-    </w:p>
-    <w:p>
-      <w:pPr>
-        <w:shd w:fill="F2F2F2" w:val="clear"/>
-        <w:ind w:left="360"/>
-      </w:pPr>
-      <w:r>
-        <w:rPr>
-          <w:rFonts w:ascii="Courier New" w:cs="Courier New" w:eastAsia="Courier New" w:hAnsi="Courier New"/>
-          <w:sz w:val="18"/>
-          <w:szCs w:val="18"/>
-        </w:rPr>
-        <w:t xml:space="preserve">  TAG="Staging"</w:t>
-      </w:r>
-    </w:p>
-    <w:p/>
-    <w:p>
-      <w:r>
-        <w:rPr>
-          <w:rFonts w:ascii="Arial" w:cs="Arial" w:eastAsia="Arial" w:hAnsi="Arial"/>
-          <w:sz w:val="22"/>
-          <w:szCs w:val="22"/>
-        </w:rPr>
-        <w:t xml:space="preserve">Parámetros utilizados:</w:t>
+        <w:t xml:space="preserve">  AGENTMONITOR=1</w:t>
       </w:r>
     </w:p>
     <w:p/>
@@ -1348,7 +1781,7 @@
                 <w:sz w:val="18"/>
                 <w:szCs w:val="18"/>
               </w:rPr>
-              <w:t xml:space="preserve">1</w:t>
+              <w:t xml:space="preserve">0 o 1</w:t>
             </w:r>
           </w:p>
         </w:tc>
@@ -1380,101 +1813,6 @@
                 <w:szCs w:val="18"/>
               </w:rPr>
               <w:t xml:space="preserve">Instala el ícono de bandeja para monitorear el agente</w:t>
-            </w:r>
-          </w:p>
-        </w:tc>
-      </w:tr>
-      <w:tr>
-        <w:tc>
-          <w:tcPr>
-            <w:tcW w:type="dxa" w:w="2200"/>
-            <w:tcBorders>
-              <w:top w:val="single" w:color="CCCCCC" w:sz="1"/>
-              <w:left w:val="single" w:color="CCCCCC" w:sz="1"/>
-              <w:bottom w:val="single" w:color="CCCCCC" w:sz="1"/>
-              <w:right w:val="single" w:color="CCCCCC" w:sz="1"/>
-            </w:tcBorders>
-            <w:shd w:fill="FFFFFF" w:val="clear"/>
-            <w:tcMar>
-              <w:top w:type="dxa" w:w="80"/>
-              <w:left w:type="dxa" w:w="120"/>
-              <w:bottom w:type="dxa" w:w="80"/>
-              <w:right w:type="dxa" w:w="120"/>
-            </w:tcMar>
-          </w:tcPr>
-          <w:p>
-            <w:r>
-              <w:rPr>
-                <w:rFonts w:ascii="Arial" w:cs="Arial" w:eastAsia="Arial" w:hAnsi="Arial"/>
-                <w:b w:val="false"/>
-                <w:bCs w:val="false"/>
-                <w:color w:val="000000"/>
-                <w:sz w:val="18"/>
-                <w:szCs w:val="18"/>
-              </w:rPr>
-              <w:t xml:space="preserve">TAG</w:t>
-            </w:r>
-          </w:p>
-        </w:tc>
-        <w:tc>
-          <w:tcPr>
-            <w:tcW w:type="dxa" w:w="2600"/>
-            <w:tcBorders>
-              <w:top w:val="single" w:color="CCCCCC" w:sz="1"/>
-              <w:left w:val="single" w:color="CCCCCC" w:sz="1"/>
-              <w:bottom w:val="single" w:color="CCCCCC" w:sz="1"/>
-              <w:right w:val="single" w:color="CCCCCC" w:sz="1"/>
-            </w:tcBorders>
-            <w:shd w:fill="FFFFFF" w:val="clear"/>
-            <w:tcMar>
-              <w:top w:type="dxa" w:w="80"/>
-              <w:left w:type="dxa" w:w="120"/>
-              <w:bottom w:type="dxa" w:w="80"/>
-              <w:right w:type="dxa" w:w="120"/>
-            </w:tcMar>
-          </w:tcPr>
-          <w:p>
-            <w:r>
-              <w:rPr>
-                <w:rFonts w:ascii="Arial" w:cs="Arial" w:eastAsia="Arial" w:hAnsi="Arial"/>
-                <w:b w:val="false"/>
-                <w:bCs w:val="false"/>
-                <w:color w:val="000000"/>
-                <w:sz w:val="18"/>
-                <w:szCs w:val="18"/>
-              </w:rPr>
-              <w:t xml:space="preserve">Staging</w:t>
-            </w:r>
-          </w:p>
-        </w:tc>
-        <w:tc>
-          <w:tcPr>
-            <w:tcW w:type="dxa" w:w="4226"/>
-            <w:tcBorders>
-              <w:top w:val="single" w:color="CCCCCC" w:sz="1"/>
-              <w:left w:val="single" w:color="CCCCCC" w:sz="1"/>
-              <w:bottom w:val="single" w:color="CCCCCC" w:sz="1"/>
-              <w:right w:val="single" w:color="CCCCCC" w:sz="1"/>
-            </w:tcBorders>
-            <w:shd w:fill="FFFFFF" w:val="clear"/>
-            <w:tcMar>
-              <w:top w:type="dxa" w:w="80"/>
-              <w:left w:type="dxa" w:w="120"/>
-              <w:bottom w:type="dxa" w:w="80"/>
-              <w:right w:type="dxa" w:w="120"/>
-            </w:tcMar>
-          </w:tcPr>
-          <w:p>
-            <w:r>
-              <w:rPr>
-                <w:rFonts w:ascii="Arial" w:cs="Arial" w:eastAsia="Arial" w:hAnsi="Arial"/>
-                <w:b w:val="false"/>
-                <w:bCs w:val="false"/>
-                <w:color w:val="000000"/>
-                <w:sz w:val="18"/>
-                <w:szCs w:val="18"/>
-              </w:rPr>
-              <w:t xml:space="preserve">Clasifica el equipo como pendiente de asignación definitiva</w:t>
             </w:r>
           </w:p>
         </w:tc>
@@ -1523,7 +1861,7 @@
                 <w:sz w:val="20"/>
                 <w:szCs w:val="20"/>
               </w:rPr>
-              <w:t xml:space="preserve">💡 SUGERENCIA:  </w:t>
+              <w:t xml:space="preserve">⚠️ IMPORTANTE:  </w:t>
             </w:r>
             <w:r>
               <w:rPr>
@@ -1531,12 +1869,431 @@
                 <w:sz w:val="20"/>
                 <w:szCs w:val="20"/>
               </w:rPr>
-              <w:t xml:space="preserve">El valor "Staging" indica que el equipo está pendiente de clasificación. Una vez asignado a su entidad en GLPI, el TAG puede actualizarse o eliminarse.</w:t>
+              <w:t xml:space="preserve">El comando debe ejecutarse desde el directorio donde se encuentra el archivo .msi, o especificar la ruta completa.</w:t>
             </w:r>
           </w:p>
         </w:tc>
       </w:tr>
     </w:tbl>
+    <w:p/>
+    <w:p>
+      <w:pPr>
+        <w:pStyle w:val="Heading1"/>
+      </w:pPr>
+      <w:r>
+        <w:rPr>
+          <w:rFonts w:ascii="Arial" w:cs="Arial" w:eastAsia="Arial" w:hAnsi="Arial"/>
+          <w:b/>
+          <w:bCs/>
+          <w:sz w:val="28"/>
+          <w:szCs w:val="28"/>
+        </w:rPr>
+        <w:t xml:space="preserve">5. Método 3 — Instalación manual (GUI)</w:t>
+      </w:r>
+    </w:p>
+    <w:p>
+      <w:pPr>
+        <w:pStyle w:val="ListParagraph"/>
+        <w:numPr>
+          <w:ilvl w:val="0"/>
+          <w:numId w:val="3"/>
+        </w:numPr>
+      </w:pPr>
+      <w:r>
+        <w:rPr>
+          <w:rFonts w:ascii="Arial" w:cs="Arial" w:eastAsia="Arial" w:hAnsi="Arial"/>
+          <w:sz w:val="22"/>
+          <w:szCs w:val="22"/>
+        </w:rPr>
+        <w:t xml:space="preserve">Descargar el instalador desde: https://github.com/glpi-project/glpi-agent/releases/latest</w:t>
+      </w:r>
+    </w:p>
+    <w:p>
+      <w:pPr>
+        <w:pStyle w:val="ListParagraph"/>
+        <w:numPr>
+          <w:ilvl w:val="0"/>
+          <w:numId w:val="3"/>
+        </w:numPr>
+      </w:pPr>
+      <w:r>
+        <w:rPr>
+          <w:rFonts w:ascii="Arial" w:cs="Arial" w:eastAsia="Arial" w:hAnsi="Arial"/>
+          <w:sz w:val="22"/>
+          <w:szCs w:val="22"/>
+        </w:rPr>
+        <w:t xml:space="preserve">Hacer doble clic sobre el archivo GLPI-Agent-X.XX-x64.msi.</w:t>
+      </w:r>
+    </w:p>
+    <w:p>
+      <w:pPr>
+        <w:pStyle w:val="ListParagraph"/>
+        <w:numPr>
+          <w:ilvl w:val="0"/>
+          <w:numId w:val="3"/>
+        </w:numPr>
+      </w:pPr>
+      <w:r>
+        <w:rPr>
+          <w:rFonts w:ascii="Arial" w:cs="Arial" w:eastAsia="Arial" w:hAnsi="Arial"/>
+          <w:sz w:val="22"/>
+          <w:szCs w:val="22"/>
+        </w:rPr>
+        <w:t xml:space="preserve">Pantalla de bienvenida — Clic en Next.</w:t>
+      </w:r>
+    </w:p>
+    <w:p>
+      <w:pPr>
+        <w:pStyle w:val="ListParagraph"/>
+        <w:numPr>
+          <w:ilvl w:val="0"/>
+          <w:numId w:val="3"/>
+        </w:numPr>
+      </w:pPr>
+      <w:r>
+        <w:rPr>
+          <w:rFonts w:ascii="Arial" w:cs="Arial" w:eastAsia="Arial" w:hAnsi="Arial"/>
+          <w:sz w:val="22"/>
+          <w:szCs w:val="22"/>
+        </w:rPr>
+        <w:t xml:space="preserve">Acuerdo de licencia — Aceptar los términos y clic en Next.</w:t>
+      </w:r>
+    </w:p>
+    <w:p>
+      <w:pPr>
+        <w:pStyle w:val="ListParagraph"/>
+        <w:numPr>
+          <w:ilvl w:val="0"/>
+          <w:numId w:val="3"/>
+        </w:numPr>
+      </w:pPr>
+      <w:r>
+        <w:rPr>
+          <w:rFonts w:ascii="Arial" w:cs="Arial" w:eastAsia="Arial" w:hAnsi="Arial"/>
+          <w:sz w:val="22"/>
+          <w:szCs w:val="22"/>
+        </w:rPr>
+        <w:t xml:space="preserve">Selección de componentes — Dejar la selección por defecto. Clic en Next.</w:t>
+      </w:r>
+    </w:p>
+    <w:p>
+      <w:pPr>
+        <w:pStyle w:val="ListParagraph"/>
+        <w:numPr>
+          <w:ilvl w:val="0"/>
+          <w:numId w:val="3"/>
+        </w:numPr>
+      </w:pPr>
+      <w:r>
+        <w:rPr>
+          <w:rFonts w:ascii="Arial" w:cs="Arial" w:eastAsia="Arial" w:hAnsi="Arial"/>
+          <w:sz w:val="22"/>
+          <w:szCs w:val="22"/>
+        </w:rPr>
+        <w:t xml:space="preserve">Configuración del servidor: Server URL: https://soporte.igeek.ar. Clic en Next.</w:t>
+      </w:r>
+    </w:p>
+    <w:p>
+      <w:pPr>
+        <w:pStyle w:val="ListParagraph"/>
+        <w:numPr>
+          <w:ilvl w:val="0"/>
+          <w:numId w:val="3"/>
+        </w:numPr>
+      </w:pPr>
+      <w:r>
+        <w:rPr>
+          <w:rFonts w:ascii="Arial" w:cs="Arial" w:eastAsia="Arial" w:hAnsi="Arial"/>
+          <w:sz w:val="22"/>
+          <w:szCs w:val="22"/>
+        </w:rPr>
+        <w:t xml:space="preserve">Modo de ejecución — Seleccionar Service (Recommended). Clic en Next.</w:t>
+      </w:r>
+    </w:p>
+    <w:p>
+      <w:pPr>
+        <w:pStyle w:val="ListParagraph"/>
+        <w:numPr>
+          <w:ilvl w:val="0"/>
+          <w:numId w:val="3"/>
+        </w:numPr>
+      </w:pPr>
+      <w:r>
+        <w:rPr>
+          <w:rFonts w:ascii="Arial" w:cs="Arial" w:eastAsia="Arial" w:hAnsi="Arial"/>
+          <w:sz w:val="22"/>
+          <w:szCs w:val="22"/>
+        </w:rPr>
+        <w:t xml:space="preserve">Opciones adicionales: marcar Add firewall exception y Run now. Clic en Next.</w:t>
+      </w:r>
+    </w:p>
+    <w:p>
+      <w:pPr>
+        <w:pStyle w:val="ListParagraph"/>
+        <w:numPr>
+          <w:ilvl w:val="0"/>
+          <w:numId w:val="3"/>
+        </w:numPr>
+      </w:pPr>
+      <w:r>
+        <w:rPr>
+          <w:rFonts w:ascii="Arial" w:cs="Arial" w:eastAsia="Arial" w:hAnsi="Arial"/>
+          <w:sz w:val="22"/>
+          <w:szCs w:val="22"/>
+        </w:rPr>
+        <w:t xml:space="preserve">Confirmación — Clic en Install. Puede requerir confirmación UAC.</w:t>
+      </w:r>
+    </w:p>
+    <w:p>
+      <w:pPr>
+        <w:pStyle w:val="ListParagraph"/>
+        <w:numPr>
+          <w:ilvl w:val="0"/>
+          <w:numId w:val="3"/>
+        </w:numPr>
+      </w:pPr>
+      <w:r>
+        <w:rPr>
+          <w:rFonts w:ascii="Arial" w:cs="Arial" w:eastAsia="Arial" w:hAnsi="Arial"/>
+          <w:sz w:val="22"/>
+          <w:szCs w:val="22"/>
+        </w:rPr>
+        <w:t xml:space="preserve">Finalización — Clic en Finish.</w:t>
+      </w:r>
+    </w:p>
+    <w:p/>
+    <w:p>
+      <w:pPr>
+        <w:pStyle w:val="Heading1"/>
+      </w:pPr>
+      <w:r>
+        <w:rPr>
+          <w:rFonts w:ascii="Arial" w:cs="Arial" w:eastAsia="Arial" w:hAnsi="Arial"/>
+          <w:b/>
+          <w:bCs/>
+          <w:sz w:val="28"/>
+          <w:szCs w:val="28"/>
+        </w:rPr>
+        <w:t xml:space="preserve">6. Verificación post-instalación</w:t>
+      </w:r>
+    </w:p>
+    <w:p>
+      <w:pPr>
+        <w:pStyle w:val="Heading2"/>
+      </w:pPr>
+      <w:r>
+        <w:rPr>
+          <w:rFonts w:ascii="Arial" w:cs="Arial" w:eastAsia="Arial" w:hAnsi="Arial"/>
+          <w:b/>
+          <w:bCs/>
+          <w:sz w:val="24"/>
+          <w:szCs w:val="24"/>
+        </w:rPr>
+        <w:t xml:space="preserve">6.1 En el equipo local</w:t>
+      </w:r>
+    </w:p>
+    <w:p>
+      <w:pPr>
+        <w:pStyle w:val="Heading3"/>
+      </w:pPr>
+      <w:r>
+        <w:rPr>
+          <w:rFonts w:ascii="Arial" w:cs="Arial" w:eastAsia="Arial" w:hAnsi="Arial"/>
+          <w:b/>
+          <w:bCs/>
+          <w:sz w:val="22"/>
+          <w:szCs w:val="22"/>
+        </w:rPr>
+        <w:t xml:space="preserve">Verificar el servicio</w:t>
+      </w:r>
+    </w:p>
+    <w:p>
+      <w:pPr>
+        <w:shd w:fill="F2F2F2" w:val="clear"/>
+        <w:ind w:left="360"/>
+      </w:pPr>
+      <w:r>
+        <w:rPr>
+          <w:rFonts w:ascii="Courier New" w:cs="Courier New" w:eastAsia="Courier New" w:hAnsi="Courier New"/>
+          <w:sz w:val="18"/>
+          <w:szCs w:val="18"/>
+        </w:rPr>
+        <w:t xml:space="preserve">sc query "GLPI-Agent"</w:t>
+      </w:r>
+    </w:p>
+    <w:p/>
+    <w:p>
+      <w:r>
+        <w:rPr>
+          <w:rFonts w:ascii="Arial" w:cs="Arial" w:eastAsia="Arial" w:hAnsi="Arial"/>
+          <w:sz w:val="22"/>
+          <w:szCs w:val="22"/>
+        </w:rPr>
+        <w:t xml:space="preserve">El estado debe mostrar RUNNING. También puede verificarse desde services.msc buscando GLPI Agent.</w:t>
+      </w:r>
+    </w:p>
+    <w:p/>
+    <w:p>
+      <w:pPr>
+        <w:pStyle w:val="Heading3"/>
+      </w:pPr>
+      <w:r>
+        <w:rPr>
+          <w:rFonts w:ascii="Arial" w:cs="Arial" w:eastAsia="Arial" w:hAnsi="Arial"/>
+          <w:b/>
+          <w:bCs/>
+          <w:sz w:val="22"/>
+          <w:szCs w:val="22"/>
+        </w:rPr>
+        <w:t xml:space="preserve">Interfaz local del agente</w:t>
+      </w:r>
+    </w:p>
+    <w:p>
+      <w:r>
+        <w:rPr>
+          <w:rFonts w:ascii="Arial" w:cs="Arial" w:eastAsia="Arial" w:hAnsi="Arial"/>
+          <w:sz w:val="22"/>
+          <w:szCs w:val="22"/>
+        </w:rPr>
+        <w:t xml:space="preserve">Abrir en el navegador: http://localhost:62354</w:t>
+      </w:r>
+    </w:p>
+    <w:p/>
+    <w:p>
+      <w:r>
+        <w:rPr>
+          <w:rFonts w:ascii="Arial" w:cs="Arial" w:eastAsia="Arial" w:hAnsi="Arial"/>
+          <w:sz w:val="22"/>
+          <w:szCs w:val="22"/>
+        </w:rPr>
+        <w:t xml:space="preserve">Desde esta interfaz puede forzarse manualmente un nuevo inventario. El acceso directo también está disponible en C:\repositorio\GLPI\.</w:t>
+      </w:r>
+    </w:p>
+    <w:p/>
+    <w:p>
+      <w:pPr>
+        <w:pStyle w:val="Heading3"/>
+      </w:pPr>
+      <w:r>
+        <w:rPr>
+          <w:rFonts w:ascii="Arial" w:cs="Arial" w:eastAsia="Arial" w:hAnsi="Arial"/>
+          <w:b/>
+          <w:bCs/>
+          <w:sz w:val="22"/>
+          <w:szCs w:val="22"/>
+        </w:rPr>
+        <w:t xml:space="preserve">Inventario local XML</w:t>
+      </w:r>
+    </w:p>
+    <w:p>
+      <w:pPr>
+        <w:shd w:fill="F2F2F2" w:val="clear"/>
+        <w:ind w:left="360"/>
+      </w:pPr>
+      <w:r>
+        <w:rPr>
+          <w:rFonts w:ascii="Courier New" w:cs="Courier New" w:eastAsia="Courier New" w:hAnsi="Courier New"/>
+          <w:sz w:val="18"/>
+          <w:szCs w:val="18"/>
+        </w:rPr>
+        <w:t xml:space="preserve">C:\repositorio\GLPI\logs\NOMBREEQUIPO.xml</w:t>
+      </w:r>
+    </w:p>
+    <w:p/>
+    <w:p>
+      <w:r>
+        <w:rPr>
+          <w:rFonts w:ascii="Arial" w:cs="Arial" w:eastAsia="Arial" w:hAnsi="Arial"/>
+          <w:sz w:val="22"/>
+          <w:szCs w:val="22"/>
+        </w:rPr>
+        <w:t xml:space="preserve">Generado automáticamente por el script al finalizar la instalación.</w:t>
+      </w:r>
+    </w:p>
+    <w:p/>
+    <w:p>
+      <w:pPr>
+        <w:pStyle w:val="Heading2"/>
+      </w:pPr>
+      <w:r>
+        <w:rPr>
+          <w:rFonts w:ascii="Arial" w:cs="Arial" w:eastAsia="Arial" w:hAnsi="Arial"/>
+          <w:b/>
+          <w:bCs/>
+          <w:sz w:val="24"/>
+          <w:szCs w:val="24"/>
+        </w:rPr>
+        <w:t xml:space="preserve">6.2 En el servidor GLPI</w:t>
+      </w:r>
+    </w:p>
+    <w:p>
+      <w:pPr>
+        <w:pStyle w:val="ListParagraph"/>
+        <w:numPr>
+          <w:ilvl w:val="0"/>
+          <w:numId w:val="3"/>
+        </w:numPr>
+      </w:pPr>
+      <w:r>
+        <w:rPr>
+          <w:rFonts w:ascii="Arial" w:cs="Arial" w:eastAsia="Arial" w:hAnsi="Arial"/>
+          <w:sz w:val="22"/>
+          <w:szCs w:val="22"/>
+        </w:rPr>
+        <w:t xml:space="preserve">Ingresar a https://soporte.igeek.ar con credenciales de administrador.</w:t>
+      </w:r>
+    </w:p>
+    <w:p>
+      <w:pPr>
+        <w:pStyle w:val="ListParagraph"/>
+        <w:numPr>
+          <w:ilvl w:val="0"/>
+          <w:numId w:val="3"/>
+        </w:numPr>
+      </w:pPr>
+      <w:r>
+        <w:rPr>
+          <w:rFonts w:ascii="Arial" w:cs="Arial" w:eastAsia="Arial" w:hAnsi="Arial"/>
+          <w:sz w:val="22"/>
+          <w:szCs w:val="22"/>
+        </w:rPr>
+        <w:t xml:space="preserve">Ir a Activos → Computadoras.</w:t>
+      </w:r>
+    </w:p>
+    <w:p>
+      <w:pPr>
+        <w:pStyle w:val="ListParagraph"/>
+        <w:numPr>
+          <w:ilvl w:val="0"/>
+          <w:numId w:val="3"/>
+        </w:numPr>
+      </w:pPr>
+      <w:r>
+        <w:rPr>
+          <w:rFonts w:ascii="Arial" w:cs="Arial" w:eastAsia="Arial" w:hAnsi="Arial"/>
+          <w:sz w:val="22"/>
+          <w:szCs w:val="22"/>
+        </w:rPr>
+        <w:t xml:space="preserve">Buscar el equipo por nombre de host o dirección IP.</w:t>
+      </w:r>
+    </w:p>
+    <w:p>
+      <w:pPr>
+        <w:pStyle w:val="ListParagraph"/>
+        <w:numPr>
+          <w:ilvl w:val="0"/>
+          <w:numId w:val="3"/>
+        </w:numPr>
+      </w:pPr>
+      <w:r>
+        <w:rPr>
+          <w:rFonts w:ascii="Arial" w:cs="Arial" w:eastAsia="Arial" w:hAnsi="Arial"/>
+          <w:sz w:val="22"/>
+          <w:szCs w:val="22"/>
+        </w:rPr>
+        <w:t xml:space="preserve">Verificar: el equipo aparece en el listado, la fecha de Última actualización de inventario corresponde a la instalación reciente, y los datos de hardware (RAM, CPU, disco) están completos.</w:t>
+      </w:r>
+    </w:p>
     <w:p/>
     <w:tbl>
       <w:tblPr>
@@ -1580,7 +2337,7 @@
                 <w:sz w:val="20"/>
                 <w:szCs w:val="20"/>
               </w:rPr>
-              <w:t xml:space="preserve">⚠️ IMPORTANTE:  </w:t>
+              <w:t xml:space="preserve">💡 SUGERENCIA:  </w:t>
             </w:r>
             <w:r>
               <w:rPr>
@@ -1588,64 +2345,7 @@
                 <w:sz w:val="20"/>
                 <w:szCs w:val="20"/>
               </w:rPr>
-              <w:t xml:space="preserve">El comando debe ejecutarse desde el directorio donde se encuentra el archivo .msi, o especificar la ruta completa al archivo.</w:t>
-            </w:r>
-          </w:p>
-        </w:tc>
-      </w:tr>
-    </w:tbl>
-    <w:p/>
-    <w:tbl>
-      <w:tblPr>
-        <w:tblW w:type="dxa" w:w="9026"/>
-        <w:tblBorders>
-          <w:top w:val="single" w:color="auto" w:sz="4"/>
-          <w:left w:val="single" w:color="auto" w:sz="4"/>
-          <w:bottom w:val="single" w:color="auto" w:sz="4"/>
-          <w:right w:val="single" w:color="auto" w:sz="4"/>
-          <w:insideH w:val="single" w:color="auto" w:sz="4"/>
-          <w:insideV w:val="single" w:color="auto" w:sz="4"/>
-        </w:tblBorders>
-      </w:tblPr>
-      <w:tblGrid>
-        <w:gridCol w:w="9026"/>
-      </w:tblGrid>
-      <w:tr>
-        <w:tc>
-          <w:tcPr>
-            <w:tcW w:type="dxa" w:w="9026"/>
-            <w:tcBorders>
-              <w:top w:val="single" w:color="CCCCCC" w:sz="1"/>
-              <w:left w:val="single" w:color="CCCCCC" w:sz="1"/>
-              <w:bottom w:val="single" w:color="CCCCCC" w:sz="1"/>
-              <w:right w:val="single" w:color="CCCCCC" w:sz="1"/>
-            </w:tcBorders>
-            <w:shd w:fill="EEF4FB" w:val="clear"/>
-            <w:tcMar>
-              <w:top w:type="dxa" w:w="80"/>
-              <w:left w:type="dxa" w:w="120"/>
-              <w:bottom w:type="dxa" w:w="80"/>
-              <w:right w:type="dxa" w:w="120"/>
-            </w:tcMar>
-          </w:tcPr>
-          <w:p>
-            <w:r>
-              <w:rPr>
-                <w:rFonts w:ascii="Arial" w:cs="Arial" w:eastAsia="Arial" w:hAnsi="Arial"/>
-                <w:b/>
-                <w:bCs/>
-                <w:sz w:val="20"/>
-                <w:szCs w:val="20"/>
-              </w:rPr>
-              <w:t xml:space="preserve">📝 NOTA:  </w:t>
-            </w:r>
-            <w:r>
-              <w:rPr>
-                <w:rFonts w:ascii="Arial" w:cs="Arial" w:eastAsia="Arial" w:hAnsi="Arial"/>
-                <w:sz w:val="20"/>
-                <w:szCs w:val="20"/>
-              </w:rPr>
-              <w:t xml:space="preserve">Desde la versión 1.8 en adelante, solo se distribuye instalador de 64 bits.</w:t>
+              <w:t xml:space="preserve">Si el equipo no aparece en los primeros 5 minutos, verificar conectividad hacia https://soporte.igeek.ar y revisar la interfaz local del agente en http://localhost:62354.</w:t>
             </w:r>
           </w:p>
         </w:tc>
@@ -1664,520 +2364,7 @@
           <w:sz w:val="28"/>
           <w:szCs w:val="28"/>
         </w:rPr>
-        <w:t xml:space="preserve">4. Método 3 — Instalación manual (GUI)</w:t>
-      </w:r>
-    </w:p>
-    <w:p>
-      <w:pPr>
-        <w:pStyle w:val="ListParagraph"/>
-        <w:numPr>
-          <w:ilvl w:val="0"/>
-          <w:numId w:val="3"/>
-        </w:numPr>
-      </w:pPr>
-      <w:r>
-        <w:rPr>
-          <w:rFonts w:ascii="Arial" w:cs="Arial" w:eastAsia="Arial" w:hAnsi="Arial"/>
-          <w:sz w:val="22"/>
-          <w:szCs w:val="22"/>
-        </w:rPr>
-        <w:t xml:space="preserve">Descargar el instalador desde: https://github.com/glpi-project/glpi-agent/releases/latest</w:t>
-      </w:r>
-    </w:p>
-    <w:p>
-      <w:pPr>
-        <w:pStyle w:val="ListParagraph"/>
-        <w:numPr>
-          <w:ilvl w:val="0"/>
-          <w:numId w:val="3"/>
-        </w:numPr>
-      </w:pPr>
-      <w:r>
-        <w:rPr>
-          <w:rFonts w:ascii="Arial" w:cs="Arial" w:eastAsia="Arial" w:hAnsi="Arial"/>
-          <w:sz w:val="22"/>
-          <w:szCs w:val="22"/>
-        </w:rPr>
-        <w:t xml:space="preserve">Hacer doble clic sobre el archivo GLPI-Agent-X.XX-x64.msi.</w:t>
-      </w:r>
-    </w:p>
-    <w:p>
-      <w:pPr>
-        <w:pStyle w:val="ListParagraph"/>
-        <w:numPr>
-          <w:ilvl w:val="0"/>
-          <w:numId w:val="3"/>
-        </w:numPr>
-      </w:pPr>
-      <w:r>
-        <w:rPr>
-          <w:rFonts w:ascii="Arial" w:cs="Arial" w:eastAsia="Arial" w:hAnsi="Arial"/>
-          <w:sz w:val="22"/>
-          <w:szCs w:val="22"/>
-        </w:rPr>
-        <w:t xml:space="preserve">Pantalla de bienvenida — Clic en Next.</w:t>
-      </w:r>
-    </w:p>
-    <w:p>
-      <w:pPr>
-        <w:pStyle w:val="ListParagraph"/>
-        <w:numPr>
-          <w:ilvl w:val="0"/>
-          <w:numId w:val="3"/>
-        </w:numPr>
-      </w:pPr>
-      <w:r>
-        <w:rPr>
-          <w:rFonts w:ascii="Arial" w:cs="Arial" w:eastAsia="Arial" w:hAnsi="Arial"/>
-          <w:sz w:val="22"/>
-          <w:szCs w:val="22"/>
-        </w:rPr>
-        <w:t xml:space="preserve">Acuerdo de licencia — Aceptar los términos y clic en Next.</w:t>
-      </w:r>
-    </w:p>
-    <w:p>
-      <w:pPr>
-        <w:pStyle w:val="ListParagraph"/>
-        <w:numPr>
-          <w:ilvl w:val="0"/>
-          <w:numId w:val="3"/>
-        </w:numPr>
-      </w:pPr>
-      <w:r>
-        <w:rPr>
-          <w:rFonts w:ascii="Arial" w:cs="Arial" w:eastAsia="Arial" w:hAnsi="Arial"/>
-          <w:sz w:val="22"/>
-          <w:szCs w:val="22"/>
-        </w:rPr>
-        <w:t xml:space="preserve">Selección de componentes — Dejar la selección por defecto. Clic en Next.</w:t>
-      </w:r>
-    </w:p>
-    <w:p>
-      <w:pPr>
-        <w:pStyle w:val="ListParagraph"/>
-        <w:numPr>
-          <w:ilvl w:val="0"/>
-          <w:numId w:val="3"/>
-        </w:numPr>
-      </w:pPr>
-      <w:r>
-        <w:rPr>
-          <w:rFonts w:ascii="Arial" w:cs="Arial" w:eastAsia="Arial" w:hAnsi="Arial"/>
-          <w:sz w:val="22"/>
-          <w:szCs w:val="22"/>
-        </w:rPr>
-        <w:t xml:space="preserve">Configuración del servidor: Server URL: https://soporte.igeek.ar | Tag: Staging. Clic en Next.</w:t>
-      </w:r>
-    </w:p>
-    <w:p>
-      <w:pPr>
-        <w:pStyle w:val="ListParagraph"/>
-        <w:numPr>
-          <w:ilvl w:val="0"/>
-          <w:numId w:val="3"/>
-        </w:numPr>
-      </w:pPr>
-      <w:r>
-        <w:rPr>
-          <w:rFonts w:ascii="Arial" w:cs="Arial" w:eastAsia="Arial" w:hAnsi="Arial"/>
-          <w:sz w:val="22"/>
-          <w:szCs w:val="22"/>
-        </w:rPr>
-        <w:t xml:space="preserve">Modo de ejecución — Seleccionar Service (Recommended). Clic en Next.</w:t>
-      </w:r>
-    </w:p>
-    <w:p>
-      <w:pPr>
-        <w:pStyle w:val="ListParagraph"/>
-        <w:numPr>
-          <w:ilvl w:val="0"/>
-          <w:numId w:val="3"/>
-        </w:numPr>
-      </w:pPr>
-      <w:r>
-        <w:rPr>
-          <w:rFonts w:ascii="Arial" w:cs="Arial" w:eastAsia="Arial" w:hAnsi="Arial"/>
-          <w:sz w:val="22"/>
-          <w:szCs w:val="22"/>
-        </w:rPr>
-        <w:t xml:space="preserve">Opciones adicionales: marcar Add firewall exception y Run now. Clic en Next.</w:t>
-      </w:r>
-    </w:p>
-    <w:p>
-      <w:pPr>
-        <w:pStyle w:val="ListParagraph"/>
-        <w:numPr>
-          <w:ilvl w:val="0"/>
-          <w:numId w:val="3"/>
-        </w:numPr>
-      </w:pPr>
-      <w:r>
-        <w:rPr>
-          <w:rFonts w:ascii="Arial" w:cs="Arial" w:eastAsia="Arial" w:hAnsi="Arial"/>
-          <w:sz w:val="22"/>
-          <w:szCs w:val="22"/>
-        </w:rPr>
-        <w:t xml:space="preserve">Confirmación — Clic en Install. Puede requerir confirmación UAC.</w:t>
-      </w:r>
-    </w:p>
-    <w:p>
-      <w:pPr>
-        <w:pStyle w:val="ListParagraph"/>
-        <w:numPr>
-          <w:ilvl w:val="0"/>
-          <w:numId w:val="3"/>
-        </w:numPr>
-      </w:pPr>
-      <w:r>
-        <w:rPr>
-          <w:rFonts w:ascii="Arial" w:cs="Arial" w:eastAsia="Arial" w:hAnsi="Arial"/>
-          <w:sz w:val="22"/>
-          <w:szCs w:val="22"/>
-        </w:rPr>
-        <w:t xml:space="preserve">Finalización — Clic en Finish.</w:t>
-      </w:r>
-    </w:p>
-    <w:p/>
-    <w:p>
-      <w:pPr>
-        <w:pStyle w:val="Heading1"/>
-      </w:pPr>
-      <w:r>
-        <w:rPr>
-          <w:rFonts w:ascii="Arial" w:cs="Arial" w:eastAsia="Arial" w:hAnsi="Arial"/>
-          <w:b/>
-          <w:bCs/>
-          <w:sz w:val="28"/>
-          <w:szCs w:val="28"/>
-        </w:rPr>
-        <w:t xml:space="preserve">5. Verificación post-instalación</w:t>
-      </w:r>
-    </w:p>
-    <w:p>
-      <w:pPr>
-        <w:pStyle w:val="Heading2"/>
-      </w:pPr>
-      <w:r>
-        <w:rPr>
-          <w:rFonts w:ascii="Arial" w:cs="Arial" w:eastAsia="Arial" w:hAnsi="Arial"/>
-          <w:b/>
-          <w:bCs/>
-          <w:sz w:val="24"/>
-          <w:szCs w:val="24"/>
-        </w:rPr>
-        <w:t xml:space="preserve">5.1 En el equipo local</w:t>
-      </w:r>
-    </w:p>
-    <w:p>
-      <w:pPr>
-        <w:pStyle w:val="Heading3"/>
-      </w:pPr>
-      <w:r>
-        <w:rPr>
-          <w:rFonts w:ascii="Arial" w:cs="Arial" w:eastAsia="Arial" w:hAnsi="Arial"/>
-          <w:b/>
-          <w:bCs/>
-          <w:sz w:val="22"/>
-          <w:szCs w:val="22"/>
-        </w:rPr>
-        <w:t xml:space="preserve">Verificar el servicio</w:t>
-      </w:r>
-    </w:p>
-    <w:p>
-      <w:r>
-        <w:rPr>
-          <w:rFonts w:ascii="Arial" w:cs="Arial" w:eastAsia="Arial" w:hAnsi="Arial"/>
-          <w:sz w:val="22"/>
-          <w:szCs w:val="22"/>
-        </w:rPr>
-        <w:t xml:space="preserve">Ejecutar en consola:</w:t>
-      </w:r>
-    </w:p>
-    <w:p/>
-    <w:p>
-      <w:pPr>
-        <w:shd w:fill="F2F2F2" w:val="clear"/>
-        <w:ind w:left="360"/>
-      </w:pPr>
-      <w:r>
-        <w:rPr>
-          <w:rFonts w:ascii="Courier New" w:cs="Courier New" w:eastAsia="Courier New" w:hAnsi="Courier New"/>
-          <w:sz w:val="18"/>
-          <w:szCs w:val="18"/>
-        </w:rPr>
-        <w:t xml:space="preserve">sc query "GLPI-Agent"</w:t>
-      </w:r>
-    </w:p>
-    <w:p/>
-    <w:p>
-      <w:r>
-        <w:rPr>
-          <w:rFonts w:ascii="Arial" w:cs="Arial" w:eastAsia="Arial" w:hAnsi="Arial"/>
-          <w:sz w:val="22"/>
-          <w:szCs w:val="22"/>
-        </w:rPr>
-        <w:t xml:space="preserve">El estado debe mostrar RUNNING. También puede verificarse desde services.msc buscando GLPI Agent.</w:t>
-      </w:r>
-    </w:p>
-    <w:p/>
-    <w:p>
-      <w:pPr>
-        <w:pStyle w:val="Heading3"/>
-      </w:pPr>
-      <w:r>
-        <w:rPr>
-          <w:rFonts w:ascii="Arial" w:cs="Arial" w:eastAsia="Arial" w:hAnsi="Arial"/>
-          <w:b/>
-          <w:bCs/>
-          <w:sz w:val="22"/>
-          <w:szCs w:val="22"/>
-        </w:rPr>
-        <w:t xml:space="preserve">Interfaz local del agente</w:t>
-      </w:r>
-    </w:p>
-    <w:p>
-      <w:r>
-        <w:rPr>
-          <w:rFonts w:ascii="Arial" w:cs="Arial" w:eastAsia="Arial" w:hAnsi="Arial"/>
-          <w:sz w:val="22"/>
-          <w:szCs w:val="22"/>
-        </w:rPr>
-        <w:t xml:space="preserve">Abrir en el navegador:</w:t>
-      </w:r>
-    </w:p>
-    <w:p/>
-    <w:p>
-      <w:pPr>
-        <w:shd w:fill="F2F2F2" w:val="clear"/>
-        <w:ind w:left="360"/>
-      </w:pPr>
-      <w:r>
-        <w:rPr>
-          <w:rFonts w:ascii="Courier New" w:cs="Courier New" w:eastAsia="Courier New" w:hAnsi="Courier New"/>
-          <w:sz w:val="18"/>
-          <w:szCs w:val="18"/>
-        </w:rPr>
-        <w:t xml:space="preserve">http://localhost:62354</w:t>
-      </w:r>
-    </w:p>
-    <w:p/>
-    <w:p>
-      <w:r>
-        <w:rPr>
-          <w:rFonts w:ascii="Arial" w:cs="Arial" w:eastAsia="Arial" w:hAnsi="Arial"/>
-          <w:sz w:val="22"/>
-          <w:szCs w:val="22"/>
-        </w:rPr>
-        <w:t xml:space="preserve">Desde esta interfaz puede forzarse manualmente un nuevo inventario.</w:t>
-      </w:r>
-    </w:p>
-    <w:p/>
-    <w:p>
-      <w:pPr>
-        <w:pStyle w:val="Heading3"/>
-      </w:pPr>
-      <w:r>
-        <w:rPr>
-          <w:rFonts w:ascii="Arial" w:cs="Arial" w:eastAsia="Arial" w:hAnsi="Arial"/>
-          <w:b/>
-          <w:bCs/>
-          <w:sz w:val="22"/>
-          <w:szCs w:val="22"/>
-        </w:rPr>
-        <w:t xml:space="preserve">Log del agente</w:t>
-      </w:r>
-    </w:p>
-    <w:p>
-      <w:r>
-        <w:rPr>
-          <w:rFonts w:ascii="Arial" w:cs="Arial" w:eastAsia="Arial" w:hAnsi="Arial"/>
-          <w:sz w:val="22"/>
-          <w:szCs w:val="22"/>
-        </w:rPr>
-        <w:t xml:space="preserve">Ubicación del archivo de log:</w:t>
-      </w:r>
-    </w:p>
-    <w:p/>
-    <w:p>
-      <w:pPr>
-        <w:shd w:fill="F2F2F2" w:val="clear"/>
-        <w:ind w:left="360"/>
-      </w:pPr>
-      <w:r>
-        <w:rPr>
-          <w:rFonts w:ascii="Courier New" w:cs="Courier New" w:eastAsia="Courier New" w:hAnsi="Courier New"/>
-          <w:sz w:val="18"/>
-          <w:szCs w:val="18"/>
-        </w:rPr>
-        <w:t xml:space="preserve">C:\Program Files\GLPI-Agent\var\glpi-agent.log</w:t>
-      </w:r>
-    </w:p>
-    <w:p/>
-    <w:p>
-      <w:r>
-        <w:rPr>
-          <w:rFonts w:ascii="Arial" w:cs="Arial" w:eastAsia="Arial" w:hAnsi="Arial"/>
-          <w:sz w:val="22"/>
-          <w:szCs w:val="22"/>
-        </w:rPr>
-        <w:t xml:space="preserve">Buscar líneas que contengan "Inventory ok" o "inventory sent" para confirmar el envío exitoso.</w:t>
-      </w:r>
-    </w:p>
-    <w:p/>
-    <w:p>
-      <w:pPr>
-        <w:pStyle w:val="Heading2"/>
-      </w:pPr>
-      <w:r>
-        <w:rPr>
-          <w:rFonts w:ascii="Arial" w:cs="Arial" w:eastAsia="Arial" w:hAnsi="Arial"/>
-          <w:b/>
-          <w:bCs/>
-          <w:sz w:val="24"/>
-          <w:szCs w:val="24"/>
-        </w:rPr>
-        <w:t xml:space="preserve">5.2 En el servidor GLPI</w:t>
-      </w:r>
-    </w:p>
-    <w:p>
-      <w:pPr>
-        <w:pStyle w:val="ListParagraph"/>
-        <w:numPr>
-          <w:ilvl w:val="0"/>
-          <w:numId w:val="3"/>
-        </w:numPr>
-      </w:pPr>
-      <w:r>
-        <w:rPr>
-          <w:rFonts w:ascii="Arial" w:cs="Arial" w:eastAsia="Arial" w:hAnsi="Arial"/>
-          <w:sz w:val="22"/>
-          <w:szCs w:val="22"/>
-        </w:rPr>
-        <w:t xml:space="preserve">Ingresar a https://soporte.igeek.ar con credenciales de administrador.</w:t>
-      </w:r>
-    </w:p>
-    <w:p>
-      <w:pPr>
-        <w:pStyle w:val="ListParagraph"/>
-        <w:numPr>
-          <w:ilvl w:val="0"/>
-          <w:numId w:val="3"/>
-        </w:numPr>
-      </w:pPr>
-      <w:r>
-        <w:rPr>
-          <w:rFonts w:ascii="Arial" w:cs="Arial" w:eastAsia="Arial" w:hAnsi="Arial"/>
-          <w:sz w:val="22"/>
-          <w:szCs w:val="22"/>
-        </w:rPr>
-        <w:t xml:space="preserve">Ir a Activos → Computadoras.</w:t>
-      </w:r>
-    </w:p>
-    <w:p>
-      <w:pPr>
-        <w:pStyle w:val="ListParagraph"/>
-        <w:numPr>
-          <w:ilvl w:val="0"/>
-          <w:numId w:val="3"/>
-        </w:numPr>
-      </w:pPr>
-      <w:r>
-        <w:rPr>
-          <w:rFonts w:ascii="Arial" w:cs="Arial" w:eastAsia="Arial" w:hAnsi="Arial"/>
-          <w:sz w:val="22"/>
-          <w:szCs w:val="22"/>
-        </w:rPr>
-        <w:t xml:space="preserve">Buscar el equipo por nombre de host o dirección IP.</w:t>
-      </w:r>
-    </w:p>
-    <w:p>
-      <w:pPr>
-        <w:pStyle w:val="ListParagraph"/>
-        <w:numPr>
-          <w:ilvl w:val="0"/>
-          <w:numId w:val="3"/>
-        </w:numPr>
-      </w:pPr>
-      <w:r>
-        <w:rPr>
-          <w:rFonts w:ascii="Arial" w:cs="Arial" w:eastAsia="Arial" w:hAnsi="Arial"/>
-          <w:sz w:val="22"/>
-          <w:szCs w:val="22"/>
-        </w:rPr>
-        <w:t xml:space="preserve">Verificar: el equipo aparece en el listado, la fecha de Última actualización de inventario corresponde a la instalación reciente, y los datos de hardware (RAM, CPU, disco) están completos.</w:t>
-      </w:r>
-    </w:p>
-    <w:p/>
-    <w:tbl>
-      <w:tblPr>
-        <w:tblW w:type="dxa" w:w="9026"/>
-        <w:tblBorders>
-          <w:top w:val="single" w:color="auto" w:sz="4"/>
-          <w:left w:val="single" w:color="auto" w:sz="4"/>
-          <w:bottom w:val="single" w:color="auto" w:sz="4"/>
-          <w:right w:val="single" w:color="auto" w:sz="4"/>
-          <w:insideH w:val="single" w:color="auto" w:sz="4"/>
-          <w:insideV w:val="single" w:color="auto" w:sz="4"/>
-        </w:tblBorders>
-      </w:tblPr>
-      <w:tblGrid>
-        <w:gridCol w:w="9026"/>
-      </w:tblGrid>
-      <w:tr>
-        <w:tc>
-          <w:tcPr>
-            <w:tcW w:type="dxa" w:w="9026"/>
-            <w:tcBorders>
-              <w:top w:val="single" w:color="CCCCCC" w:sz="1"/>
-              <w:left w:val="single" w:color="CCCCCC" w:sz="1"/>
-              <w:bottom w:val="single" w:color="CCCCCC" w:sz="1"/>
-              <w:right w:val="single" w:color="CCCCCC" w:sz="1"/>
-            </w:tcBorders>
-            <w:shd w:fill="EEF4FB" w:val="clear"/>
-            <w:tcMar>
-              <w:top w:type="dxa" w:w="80"/>
-              <w:left w:type="dxa" w:w="120"/>
-              <w:bottom w:type="dxa" w:w="80"/>
-              <w:right w:type="dxa" w:w="120"/>
-            </w:tcMar>
-          </w:tcPr>
-          <w:p>
-            <w:r>
-              <w:rPr>
-                <w:rFonts w:ascii="Arial" w:cs="Arial" w:eastAsia="Arial" w:hAnsi="Arial"/>
-                <w:b/>
-                <w:bCs/>
-                <w:sz w:val="20"/>
-                <w:szCs w:val="20"/>
-              </w:rPr>
-              <w:t xml:space="preserve">💡 SUGERENCIA:  </w:t>
-            </w:r>
-            <w:r>
-              <w:rPr>
-                <w:rFonts w:ascii="Arial" w:cs="Arial" w:eastAsia="Arial" w:hAnsi="Arial"/>
-                <w:sz w:val="20"/>
-                <w:szCs w:val="20"/>
-              </w:rPr>
-              <w:t xml:space="preserve">Si el equipo no aparece en los primeros 5 minutos, verificar conectividad hacia https://soporte.igeek.ar y revisar el log local del agente.</w:t>
-            </w:r>
-          </w:p>
-        </w:tc>
-      </w:tr>
-    </w:tbl>
-    <w:p/>
-    <w:p>
-      <w:pPr>
-        <w:pStyle w:val="Heading1"/>
-      </w:pPr>
-      <w:r>
-        <w:rPr>
-          <w:rFonts w:ascii="Arial" w:cs="Arial" w:eastAsia="Arial" w:hAnsi="Arial"/>
-          <w:b/>
-          <w:bCs/>
-          <w:sz w:val="28"/>
-          <w:szCs w:val="28"/>
-        </w:rPr>
-        <w:t xml:space="preserve">6. Desinstalación</w:t>
+        <w:t xml:space="preserve">7. Desinstalación</w:t>
       </w:r>
     </w:p>
     <w:p>

</xml_diff>